<commit_message>
version fr et ang ok
</commit_message>
<xml_diff>
--- a/Rapports_mensuels/Mois2026_06/ipc_note_08_ang_2026_06.docx
+++ b/Rapports_mensuels/Mois2026_06/ipc_note_08_ang_2026_06.docx
@@ -132,7 +132,7 @@
         <w:pStyle w:val="ipcpara0"/>
       </w:pPr>
       <w:r>
-        <w:t xml:space="preserve">In June 2026, the consumer price index for households in the city of city of Tetouan decreased by 1,0% compared to the previous month. On an annual level, the consumer price index increased by 1,1%.</w:t>
+        <w:t xml:space="preserve">In June 2026, the consumer price index for households in the city of Tetouan decreased by 1,0% compared to the previous month. On an annual level, the consumer price index increased by 1,1%.</w:t>
       </w:r>
     </w:p>
     <w:p>
@@ -160,7 +160,7 @@
         <w:t xml:space="preserve"> </w:t>
       </w:r>
       <w:r>
-        <w:t xml:space="preserve">The food product price index decreased by 1,6% in June 2026 compared to May 2026, due to the decline in prices of «Fish and Seafood» by 5,1%, «Vegetables» by 4,0%, «Fruits» by 2,8%, «Meat» by 2,4%, «Food Productsnot elsewhere classified» by 1,7% and «Milk, Cheese and Eggs» by 0,2%.</w:t>
+        <w:t xml:space="preserve">The food product price index decreased by 1,6% in June 2026 compared to May 2026, due to the decline in prices of «Fish and Seafood» by 5,1%, «Vegetables» by 4,0%, «Fruits» by 2,8%, «Meats» by 2,4%, «Food Products not elsewhere classified» by 1,7% and «Milk, Cheese and Eggs» by 0,2%.</w:t>
       </w:r>
     </w:p>
     <w:p>
@@ -168,7 +168,7 @@
         <w:pStyle w:val="ipccorps"/>
       </w:pPr>
       <w:r>
-        <w:t xml:space="preserve">Similarly, the monthly variation of the index for the non-food products decreased by 0,5% due to drop in prices in the following divisions: «Transportation» by 3,0%, «Clothing and Shoes» by 0,9% and «Housing, Water, Gas, Electricity and Other Fuels» and «Various Goods and Services» by 0,2%. Also, the increase in prices of the following divisions: «Furniture, Household Items and Routine Home Maintenance» by 0,4% and «Restaurants and Hotels» by 0,2%. As well as, the stagnation of the indices of the other divisions did not impact the general evolution.</w:t>
+        <w:t xml:space="preserve">Similarly, the monthly variation of the index for the non-food products decreased by 0,5% due to drop in prices in the following divisions: «Transports» by 3,0%, «Clothing and Shoes» by 0,9% and «Housing, Water, Gas, Electricity and Other Fuels» and «Various Goods and Services» by 0,2%. Also, the increase in prices of the following divisions: «Furniture, Household Items and Routine Home Maintenance» by 0,4% and «Restaurants and Hotels» by 0,2%. As well as, the stagnation of the indices of the other divisions did not impact the general evolution.</w:t>
       </w:r>
     </w:p>
     <w:p>
@@ -186,7 +186,7 @@
         <w:t xml:space="preserve"> </w:t>
       </w:r>
       <w:r>
-        <w:t xml:space="preserve">the food product price index decreased by 1,3% in June 2026 compared to June 2025 , due to the decrease in the prices of «Oils and Fats» by 18,9%, «Milk, Cheese and Eggs» by 3,1%, «Vegetables» by 1,9%, «Fish and Seafood» by 0,7% and «Bread and Cereals» by 0,1%. Moreover, the rise in prices of «Meat» by 5,5%, «Tobacco» by 4,0%, «Sugar, Jam, Honey, Chocolate and Confectionery» by 1,8%, «Fruits», «Cafe and Tea and Cocoa» by 0,9% and «Mineral Waters, Soft Drinks, Fruit and Vegetable Juices (Nd)» by 0,7% and the stagnation in prices for «Food Productsnot elsewhere classified» by 0,0% did not affect the general evolution.</w:t>
+        <w:t xml:space="preserve">the food product price index decreased by 1,3% in June 2026 compared to June 2025 , due to the decrease in the prices of «Oils and Fats» by 18,9%, «Milk, Cheese and Eggs» by 3,1%, «Vegetables» by 1,9%, «Fish and Seafood» by 0,7% and «Bread and Cereals» by 0,1%. Moreover, the rise in prices of «Meats» by 5,5%, «Tobacco» by 4,0%, «Sugar, Jam, Honey, Chocolate and Confectionery» by 1,8%, «Fruits», «Cafe and Tea and Cocoa» by 0,9% and «Mineral Waters, Soft Drinks, Fruit and Vegetable Juices» by 0,7% and the stagnation in prices for «Food Products not elsewhere classified» did not affect the general evolution.</w:t>
       </w:r>
     </w:p>
     <w:p>
@@ -274,7 +274,7 @@
         <w:pStyle w:val="ipctitre0"/>
       </w:pPr>
       <w:r>
-        <w:t xml:space="preserve">4- Evolution of the monthly variation of the consumer price index</w:t>
+        <w:t xml:space="preserve">4- Evolution of the monthly variation (%) of the consumer price index</w:t>
       </w:r>
     </w:p>
     <w:p>
@@ -338,7 +338,7 @@
         <w:t xml:space="preserve"> </w:t>
       </w:r>
       <w:r>
-        <w:t xml:space="preserve">The level of price variation in June 2026 decreased by -1,0% after being -0,7% in May 2026</w:t>
+        <w:t xml:space="preserve">The level of price variation in June 2026 decreased by 1,0% after being -0,7% in May 2026</w:t>
       </w:r>
     </w:p>
     <w:p>
@@ -9333,35 +9333,6 @@
       </w:r>
       <w:r>
         <w:t xml:space="preserve">High Commission for Planning, Department of Statistics - National consumer price survey</w:t>
-      </w:r>
-    </w:p>
-    <w:p>
-      <w:pPr>
-        <w:pStyle w:val="ipcpiedpage"/>
-      </w:pPr>
-      <w:r>
-        <w:t xml:space="preserve">Angle Avenue Ibn Tachafine et Avenue Ibn Toumart B.P.104 Tanger</w:t>
-      </w:r>
-      <w:r>
-        <w:br/>
-      </w:r>
-      <w:r>
-        <w:t xml:space="preserve">****</w:t>
-      </w:r>
-      <w:r>
-        <w:t xml:space="preserve">Tél</w:t>
-      </w:r>
-      <w:r>
-        <w:t xml:space="preserve">:0539940698****Fax:0539940364</w:t>
-      </w:r>
-      <w:r>
-        <w:t xml:space="preserve"> </w:t>
-      </w:r>
-      <w:r>
-        <w:t xml:space="preserve">Site Web</w:t>
-      </w:r>
-      <w:r>
-        <w:t xml:space="preserve">: www.hcp.ma/region-tanger Email:hcp.dr.tanger@hcp.ma</w:t>
       </w:r>
     </w:p>
     <w:p>

</xml_diff>